<commit_message>
updated resume files and cleaned redundant code
</commit_message>
<xml_diff>
--- a/resume.docx
+++ b/resume.docx
@@ -56,24 +56,45 @@
           <w:sz w:val="18"/>
         </w:rPr>
       </w:pPr>
-      <w:r>
-        <w:rPr>
-          <w:sz w:val="18"/>
-        </w:rPr>
-        <w:t>LinkedIn | Portfolio</w:t>
-      </w:r>
+      <w:hyperlink r:id="rId6" w:history="1">
+        <w:r>
+          <w:rPr>
+            <w:rStyle w:val="Hyperlink"/>
+            <w:sz w:val="18"/>
+          </w:rPr>
+          <w:t>LinkedIn</w:t>
+        </w:r>
+      </w:hyperlink>
       <w:r>
         <w:rPr>
           <w:sz w:val="18"/>
         </w:rPr>
         <w:t xml:space="preserve"> | </w:t>
       </w:r>
+      <w:hyperlink r:id="rId7" w:history="1">
+        <w:r>
+          <w:rPr>
+            <w:rStyle w:val="Hyperlink"/>
+            <w:sz w:val="18"/>
+          </w:rPr>
+          <w:t>Portfolio</w:t>
+        </w:r>
+      </w:hyperlink>
       <w:r>
         <w:rPr>
           <w:sz w:val="18"/>
         </w:rPr>
-        <w:t>GitHub</w:t>
+        <w:t xml:space="preserve"> | </w:t>
       </w:r>
+      <w:hyperlink r:id="rId8" w:history="1">
+        <w:r>
+          <w:rPr>
+            <w:rStyle w:val="Hyperlink"/>
+            <w:sz w:val="18"/>
+          </w:rPr>
+          <w:t>GitHub</w:t>
+        </w:r>
+      </w:hyperlink>
     </w:p>
     <w:p>
       <w:pPr>
@@ -235,14 +256,7 @@
                             <w:b/>
                             <w:sz w:val="20"/>
                           </w:rPr>
-                          <w:t>Jan 2026</w:t>
-                        </w:r>
-                        <w:r>
-                          <w:rPr>
-                            <w:b/>
-                            <w:sz w:val="20"/>
-                          </w:rPr>
-                          <w:t xml:space="preserve"> – Present</w:t>
+                          <w:t>Jan 2026 – Present</w:t>
                         </w:r>
                       </w:p>
                     </w:tc>
@@ -1745,21 +1759,7 @@
                       <w:b/>
                       <w:sz w:val="20"/>
                     </w:rPr>
-                    <w:t>Aug 2023</w:t>
-                  </w:r>
-                  <w:r>
-                    <w:rPr>
-                      <w:b/>
-                      <w:sz w:val="20"/>
-                    </w:rPr>
-                    <w:t xml:space="preserve"> – </w:t>
-                  </w:r>
-                  <w:r>
-                    <w:rPr>
-                      <w:b/>
-                      <w:sz w:val="20"/>
-                    </w:rPr>
-                    <w:t>Present</w:t>
+                    <w:t>Aug 2023 – Present</w:t>
                   </w:r>
                 </w:p>
               </w:tc>
@@ -13697,6 +13697,29 @@
       </w:tcPr>
     </w:tblStylePr>
   </w:style>
+  <w:style w:type="character" w:styleId="Hyperlink">
+    <w:name w:val="Hyperlink"/>
+    <w:basedOn w:val="DefaultParagraphFont"/>
+    <w:uiPriority w:val="99"/>
+    <w:unhideWhenUsed/>
+    <w:rsid w:val="000E00A5"/>
+    <w:rPr>
+      <w:color w:val="0000FF" w:themeColor="hyperlink"/>
+      <w:u w:val="single"/>
+    </w:rPr>
+  </w:style>
+  <w:style w:type="character" w:styleId="UnresolvedMention">
+    <w:name w:val="Unresolved Mention"/>
+    <w:basedOn w:val="DefaultParagraphFont"/>
+    <w:uiPriority w:val="99"/>
+    <w:semiHidden/>
+    <w:unhideWhenUsed/>
+    <w:rsid w:val="000E00A5"/>
+    <w:rPr>
+      <w:color w:val="605E5C"/>
+      <w:shd w:val="clear" w:color="auto" w:fill="E1DFDD"/>
+    </w:rPr>
+  </w:style>
 </w:styles>
 </file>
 

</xml_diff>